<commit_message>
Make sure that for loop module, chunks start/end with <w:p> </w:p>
</commit_message>
<xml_diff>
--- a/examples/expected-nextpage-section-break.docx
+++ b/examples/expected-nextpage-section-break.docx
@@ -46,8 +46,6 @@
         <w:rPr/>
         <w:t xml:space="preserve">Looped Doc p1 of 2</w:t>
       </w:r>
-    </w:p>
-    <w:p>
       <w:r>
         <w:br w:type="page"/>
       </w:r>
@@ -63,8 +61,6 @@
         <w:rPr/>
         <w:t xml:space="preserve">Looped Doc p2 of 2</w:t>
       </w:r>
-    </w:p>
-    <w:p>
       <w:r>
         <w:br w:type="page"/>
       </w:r>
@@ -80,8 +76,6 @@
         <w:rPr/>
         <w:t xml:space="preserve">Looped Doc p3 of 2</w:t>
       </w:r>
-    </w:p>
-    <w:p>
       <w:r>
         <w:br w:type="page"/>
       </w:r>
@@ -97,8 +91,6 @@
         <w:rPr/>
         <w:t xml:space="preserve">Looped Doc p4 of 2</w:t>
       </w:r>
-    </w:p>
-    <w:p>
       <w:r>
         <w:br w:type="page"/>
       </w:r>

</xml_diff>